<commit_message>
Docs: record the linked EAS project and first APK build
Co-Authored-By: Claude Opus 5.5 <noreply@anthropic.com>
Claude-Session: https://claude.ai/code/session_01Ecagw4rw5ZJHN22sLkWhnn
</commit_message>
<xml_diff>
--- a/docs/yatlu-reference.docx
+++ b/docs/yatlu-reference.docx
@@ -7050,6 +7050,115 @@
           <w:rtl/>
         </w:rPr>
         <w:t xml:space="preserve">.</w:t>
+      </w:r>
+    </w:p>
+    <w:p>
+      <w:pPr>
+        <w:bidi/>
+        <w:bidi/>
+      </w:pPr>
+      <w:r>
+        <w:rPr>
+          <w:rtl/>
+          <w:rtl/>
+          <w:bCs/>
+          <w:b/>
+        </w:rPr>
+        <w:t xml:space="preserve">المشروع مربوط بالفعل</w:t>
+      </w:r>
+      <w:r>
+        <w:rPr>
+          <w:rtl/>
+          <w:rtl/>
+        </w:rPr>
+        <w:t xml:space="preserve"> </w:t>
+      </w:r>
+      <w:r>
+        <w:rPr>
+          <w:rtl/>
+          <w:rtl/>
+        </w:rPr>
+        <w:t xml:space="preserve">بحساب</w:t>
+      </w:r>
+      <w:r>
+        <w:rPr>
+          <w:rtl/>
+          <w:rtl/>
+        </w:rPr>
+        <w:t xml:space="preserve"> </w:t>
+      </w:r>
+      <w:r>
+        <w:rPr>
+          <w:rtl/>
+          <w:rStyle w:val="VerbatimChar"/>
+          <w:rtl/>
+        </w:rPr>
+        <w:t xml:space="preserve">moumenhafez</w:t>
+      </w:r>
+      <w:r>
+        <w:rPr>
+          <w:rtl/>
+          <w:rtl/>
+        </w:rPr>
+        <w:t xml:space="preserve"> </w:t>
+      </w:r>
+      <w:r>
+        <w:rPr>
+          <w:rtl/>
+          <w:rtl/>
+        </w:rPr>
+        <w:t xml:space="preserve">(مشروع</w:t>
+      </w:r>
+      <w:r>
+        <w:rPr>
+          <w:rtl/>
+          <w:rtl/>
+        </w:rPr>
+        <w:t xml:space="preserve"> </w:t>
+      </w:r>
+      <w:r>
+        <w:rPr>
+          <w:rtl/>
+          <w:rStyle w:val="VerbatimChar"/>
+          <w:rtl/>
+        </w:rPr>
+        <w:t xml:space="preserve">@moumenhafez/yatlu</w:t>
+      </w:r>
+      <w:r>
+        <w:rPr>
+          <w:rtl/>
+          <w:rtl/>
+        </w:rPr>
+        <w:t xml:space="preserve">)، ومفتاح التوقيع محفوظ على Expo — فالخطوة ٢ مش محتاجة تتكرر. أي بناء جديد:</w:t>
+      </w:r>
+      <w:r>
+        <w:rPr>
+          <w:rtl/>
+          <w:rtl/>
+        </w:rPr>
+        <w:t xml:space="preserve"> </w:t>
+      </w:r>
+      <w:r>
+        <w:rPr>
+          <w:rtl/>
+          <w:rStyle w:val="VerbatimChar"/>
+          <w:rtl/>
+        </w:rPr>
+        <w:t xml:space="preserve">npm run build:apk</w:t>
+      </w:r>
+      <w:r>
+        <w:rPr>
+          <w:rtl/>
+          <w:rtl/>
+        </w:rPr>
+        <w:t xml:space="preserve"> </w:t>
+      </w:r>
+      <w:r>
+        <w:rPr>
+          <w:rtl/>
+          <w:rtl/>
+        </w:rPr>
+        <w:t xml:space="preserve">بس. الحساب المجاني بيقف في طابور قبل البناء (ممكن ساعة أو أكتر).</w:t>
       </w:r>
     </w:p>
     <w:p>

</xml_diff>

<commit_message>
"I am Muslim" daily roadmap; Arabic + all toggles on by default; dark tab bar fix
- /muslim: time-ordered day plan (prayers, azkar, wird, listening, Gaza duas, tasbih, Kahf on Friday)
  with auto-ticking from azkar completion, tasbih target, finished surah, Kahf reading, prayer log, wird
- Home card with progress and next activity; activity log stored and backed up
- First launch defaults to Arabic with every toggle enabled (except DST)
- Native tab bar: explicit icon/label colors and surface background for dark themes
- Docs, reference and changelog updated

Co-Authored-By: Claude Opus 5.5 <noreply@anthropic.com>
Claude-Session: https://claude.ai/code/session_01Ecagw4rw5ZJHN22sLkWhnn
</commit_message>
<xml_diff>
--- a/docs/yatlu-reference.docx
+++ b/docs/yatlu-reference.docx
@@ -278,7 +278,7 @@
         </w:p>
       </w:sdtContent>
     </w:sdt>
-    <w:bookmarkStart w:id="52" w:name="يتلو-المرجع-الشامل"/>
+    <w:bookmarkStart w:id="53" w:name="يتلو-المرجع-الشامل"/>
     <w:p>
       <w:pPr>
         <w:bidi/>
@@ -1922,7 +1922,7 @@
       </w:r>
     </w:p>
     <w:bookmarkEnd w:id="22"/>
-    <w:bookmarkStart w:id="32" w:name="الميزات-من-منظور-المستخدم"/>
+    <w:bookmarkStart w:id="33" w:name="الميزات-من-منظور-المستخدم"/>
     <w:p>
       <w:pPr>
         <w:bidi/>
@@ -1995,8 +1995,24 @@
         <w:rPr>
           <w:rtl/>
           <w:rtl/>
-        </w:rPr>
-        <w:t xml:space="preserve">العنوان: لوجو «يَتْلُو» بلون الثيم.</w:t>
+          <w:bCs/>
+          <w:b/>
+        </w:rPr>
+        <w:t xml:space="preserve">كارت «أنا مسلم»</w:t>
+      </w:r>
+      <w:r>
+        <w:rPr>
+          <w:rtl/>
+          <w:rtl/>
+        </w:rPr>
+        <w:t xml:space="preserve"> </w:t>
+      </w:r>
+      <w:r>
+        <w:rPr>
+          <w:rtl/>
+          <w:rtl/>
+        </w:rPr>
+        <w:t xml:space="preserve">بالتقدّم والنشاط الجاي (بيفتح خريطة اليوم).</w:t>
       </w:r>
     </w:p>
     <w:p>
@@ -2014,106 +2030,7 @@
           <w:rtl/>
           <w:rtl/>
         </w:rPr>
-        <w:t xml:space="preserve">أزرار الهيدر:</w:t>
-      </w:r>
-      <w:r>
-        <w:rPr>
-          <w:rtl/>
-          <w:rtl/>
-        </w:rPr>
-        <w:t xml:space="preserve"> </w:t>
-      </w:r>
-      <w:r>
-        <w:rPr>
-          <w:rtl/>
-          <w:rtl/>
-          <w:bCs/>
-          <w:b/>
-        </w:rPr>
-        <w:t xml:space="preserve">التنبيهات</w:t>
-      </w:r>
-      <w:r>
-        <w:rPr>
-          <w:rtl/>
-          <w:rtl/>
-        </w:rPr>
-        <w:t xml:space="preserve"> </w:t>
-      </w:r>
-      <w:r>
-        <w:rPr>
-          <w:rtl/>
-          <w:rtl/>
-        </w:rPr>
-        <w:t xml:space="preserve">(بعدد غير المقروء)،</w:t>
-      </w:r>
-      <w:r>
-        <w:rPr>
-          <w:rtl/>
-          <w:rtl/>
-        </w:rPr>
-        <w:t xml:space="preserve"> </w:t>
-      </w:r>
-      <w:r>
-        <w:rPr>
-          <w:rtl/>
-          <w:rtl/>
-          <w:bCs/>
-          <w:b/>
-        </w:rPr>
-        <w:t xml:space="preserve">البحث</w:t>
-      </w:r>
-      <w:r>
-        <w:rPr>
-          <w:rtl/>
-          <w:rtl/>
-        </w:rPr>
-        <w:t xml:space="preserve">،</w:t>
-      </w:r>
-      <w:r>
-        <w:rPr>
-          <w:rtl/>
-          <w:rtl/>
-        </w:rPr>
-        <w:t xml:space="preserve"> </w:t>
-      </w:r>
-      <w:r>
-        <w:rPr>
-          <w:rtl/>
-          <w:rtl/>
-          <w:bCs/>
-          <w:b/>
-        </w:rPr>
-        <w:t xml:space="preserve">الانتقال لصفحة/آية</w:t>
-      </w:r>
-      <w:r>
-        <w:rPr>
-          <w:rtl/>
-          <w:rtl/>
-        </w:rPr>
-        <w:t xml:space="preserve">،</w:t>
-      </w:r>
-      <w:r>
-        <w:rPr>
-          <w:rtl/>
-          <w:rtl/>
-        </w:rPr>
-        <w:t xml:space="preserve"> </w:t>
-      </w:r>
-      <w:r>
-        <w:rPr>
-          <w:rtl/>
-          <w:rtl/>
-          <w:bCs/>
-          <w:b/>
-        </w:rPr>
-        <w:t xml:space="preserve">العلامات</w:t>
-      </w:r>
-      <w:r>
-        <w:rPr>
-          <w:rtl/>
-          <w:rtl/>
-        </w:rPr>
-        <w:t xml:space="preserve">.</w:t>
+        <w:t xml:space="preserve">العنوان: لوجو «يَتْلُو» بلون الثيم.</w:t>
       </w:r>
     </w:p>
     <w:p>
@@ -2130,24 +2047,107 @@
         <w:rPr>
           <w:rtl/>
           <w:rtl/>
+        </w:rPr>
+        <w:t xml:space="preserve">أزرار الهيدر:</w:t>
+      </w:r>
+      <w:r>
+        <w:rPr>
+          <w:rtl/>
+          <w:rtl/>
+        </w:rPr>
+        <w:t xml:space="preserve"> </w:t>
+      </w:r>
+      <w:r>
+        <w:rPr>
+          <w:rtl/>
+          <w:rtl/>
           <w:bCs/>
           <w:b/>
         </w:rPr>
-        <w:t xml:space="preserve">متابعة القراءة</w:t>
-      </w:r>
-      <w:r>
-        <w:rPr>
-          <w:rtl/>
-          <w:rtl/>
-        </w:rPr>
-        <w:t xml:space="preserve"> </w:t>
-      </w:r>
-      <w:r>
-        <w:rPr>
-          <w:rtl/>
-          <w:rtl/>
-        </w:rPr>
-        <w:t xml:space="preserve">(آخر صفحة).</w:t>
+        <w:t xml:space="preserve">التنبيهات</w:t>
+      </w:r>
+      <w:r>
+        <w:rPr>
+          <w:rtl/>
+          <w:rtl/>
+        </w:rPr>
+        <w:t xml:space="preserve"> </w:t>
+      </w:r>
+      <w:r>
+        <w:rPr>
+          <w:rtl/>
+          <w:rtl/>
+        </w:rPr>
+        <w:t xml:space="preserve">(بعدد غير المقروء)،</w:t>
+      </w:r>
+      <w:r>
+        <w:rPr>
+          <w:rtl/>
+          <w:rtl/>
+        </w:rPr>
+        <w:t xml:space="preserve"> </w:t>
+      </w:r>
+      <w:r>
+        <w:rPr>
+          <w:rtl/>
+          <w:rtl/>
+          <w:bCs/>
+          <w:b/>
+        </w:rPr>
+        <w:t xml:space="preserve">البحث</w:t>
+      </w:r>
+      <w:r>
+        <w:rPr>
+          <w:rtl/>
+          <w:rtl/>
+        </w:rPr>
+        <w:t xml:space="preserve">،</w:t>
+      </w:r>
+      <w:r>
+        <w:rPr>
+          <w:rtl/>
+          <w:rtl/>
+        </w:rPr>
+        <w:t xml:space="preserve"> </w:t>
+      </w:r>
+      <w:r>
+        <w:rPr>
+          <w:rtl/>
+          <w:rtl/>
+          <w:bCs/>
+          <w:b/>
+        </w:rPr>
+        <w:t xml:space="preserve">الانتقال لصفحة/آية</w:t>
+      </w:r>
+      <w:r>
+        <w:rPr>
+          <w:rtl/>
+          <w:rtl/>
+        </w:rPr>
+        <w:t xml:space="preserve">،</w:t>
+      </w:r>
+      <w:r>
+        <w:rPr>
+          <w:rtl/>
+          <w:rtl/>
+        </w:rPr>
+        <w:t xml:space="preserve"> </w:t>
+      </w:r>
+      <w:r>
+        <w:rPr>
+          <w:rtl/>
+          <w:rtl/>
+          <w:bCs/>
+          <w:b/>
+        </w:rPr>
+        <w:t xml:space="preserve">العلامات</w:t>
+      </w:r>
+      <w:r>
+        <w:rPr>
+          <w:rtl/>
+          <w:rtl/>
+        </w:rPr>
+        <w:t xml:space="preserve">.</w:t>
       </w:r>
     </w:p>
     <w:p>
@@ -2167,21 +2167,21 @@
           <w:bCs/>
           <w:b/>
         </w:rPr>
-        <w:t xml:space="preserve">الورد اليومي والختمة:</w:t>
-      </w:r>
-      <w:r>
-        <w:rPr>
-          <w:rtl/>
-          <w:rtl/>
-        </w:rPr>
-        <w:t xml:space="preserve"> </w:t>
-      </w:r>
-      <w:r>
-        <w:rPr>
-          <w:rtl/>
-          <w:rtl/>
-        </w:rPr>
-        <w:t xml:space="preserve">نطاق ورد النهارده، ونسبة الختمة، و«ابدأ الورد» و«خلّصت»، و«ختمة جديدة».</w:t>
+        <w:t xml:space="preserve">متابعة القراءة</w:t>
+      </w:r>
+      <w:r>
+        <w:rPr>
+          <w:rtl/>
+          <w:rtl/>
+        </w:rPr>
+        <w:t xml:space="preserve"> </w:t>
+      </w:r>
+      <w:r>
+        <w:rPr>
+          <w:rtl/>
+          <w:rtl/>
+        </w:rPr>
+        <w:t xml:space="preserve">(آخر صفحة).</w:t>
       </w:r>
     </w:p>
     <w:p>
@@ -2198,6 +2198,40 @@
         <w:rPr>
           <w:rtl/>
           <w:rtl/>
+          <w:bCs/>
+          <w:b/>
+        </w:rPr>
+        <w:t xml:space="preserve">الورد اليومي والختمة:</w:t>
+      </w:r>
+      <w:r>
+        <w:rPr>
+          <w:rtl/>
+          <w:rtl/>
+        </w:rPr>
+        <w:t xml:space="preserve"> </w:t>
+      </w:r>
+      <w:r>
+        <w:rPr>
+          <w:rtl/>
+          <w:rtl/>
+        </w:rPr>
+        <w:t xml:space="preserve">نطاق ورد النهارده، ونسبة الختمة، و«ابدأ الورد» و«خلّصت»، و«ختمة جديدة».</w:t>
+      </w:r>
+    </w:p>
+    <w:p>
+      <w:pPr>
+        <w:bidi/>
+        <w:numPr>
+          <w:ilvl w:val="0"/>
+          <w:numId w:val="1002"/>
+        </w:numPr>
+        <w:pStyle w:val="Compact"/>
+        <w:bidi/>
+      </w:pPr>
+      <w:r>
+        <w:rPr>
+          <w:rtl/>
+          <w:rtl/>
         </w:rPr>
         <w:t xml:space="preserve">قوايم:</w:t>
       </w:r>
@@ -3149,7 +3183,7 @@
       </w:r>
     </w:p>
     <w:bookmarkEnd w:id="28"/>
-    <w:bookmarkStart w:id="29" w:name="الإعدادات"/>
+    <w:bookmarkStart w:id="29" w:name="أنا-مسلم-muslim"/>
     <w:p>
       <w:pPr>
         <w:bidi/>
@@ -3161,6 +3195,50 @@
           <w:rtl/>
           <w:rtl/>
         </w:rPr>
+        <w:t xml:space="preserve">3.6.1 أنا مسلم (</w:t>
+      </w:r>
+      <w:r>
+        <w:rPr>
+          <w:rtl/>
+          <w:rStyle w:val="VerbatimChar"/>
+          <w:rtl/>
+        </w:rPr>
+        <w:t xml:space="preserve">/muslim</w:t>
+      </w:r>
+      <w:r>
+        <w:rPr>
+          <w:rtl/>
+          <w:rtl/>
+        </w:rPr>
+        <w:t xml:space="preserve">)</w:t>
+      </w:r>
+    </w:p>
+    <w:p>
+      <w:pPr>
+        <w:bidi/>
+        <w:bidi/>
+      </w:pPr>
+      <w:r>
+        <w:rPr>
+          <w:rtl/>
+          <w:rtl/>
+        </w:rPr>
+        <w:t xml:space="preserve">خريطة طريق لليوم بالوقت: الصلوات، أذكار الصباح والمساء والنوم، الورد، سماع القرآن، الدعاء لغزة، التسبيح، والكهف يوم الجمعة. الضغط بيوديك للنشاط، وبيتعلّم لوحده لما يخلص (أو يدوي من الدايرة).</w:t>
+      </w:r>
+    </w:p>
+    <w:bookmarkEnd w:id="29"/>
+    <w:bookmarkStart w:id="30" w:name="الإعدادات"/>
+    <w:p>
+      <w:pPr>
+        <w:bidi/>
+        <w:pStyle w:val="Heading3"/>
+        <w:bidi/>
+      </w:pPr>
+      <w:r>
+        <w:rPr>
+          <w:rtl/>
+          <w:rtl/>
+        </w:rPr>
         <w:t xml:space="preserve">3.7 الإعدادات</w:t>
       </w:r>
     </w:p>
@@ -3173,12 +3251,42 @@
         <w:rPr>
           <w:rtl/>
           <w:rtl/>
+          <w:bCs/>
+          <w:b/>
+        </w:rPr>
+        <w:t xml:space="preserve">أول تشغيل:</w:t>
+      </w:r>
+      <w:r>
+        <w:rPr>
+          <w:rtl/>
+          <w:rtl/>
+        </w:rPr>
+        <w:t xml:space="preserve"> </w:t>
+      </w:r>
+      <w:r>
+        <w:rPr>
+          <w:rtl/>
+          <w:rtl/>
+        </w:rPr>
+        <w:t xml:space="preserve">عربي، وكل المفاتيح مفعّلة ما عدا «التوقيت الصيفي» (بيبوّظ المواقيت لو الموبايل متظبط).</w:t>
+      </w:r>
+      <w:r>
+        <w:rPr>
+          <w:rtl/>
+          <w:rtl/>
+        </w:rPr>
+        <w:t xml:space="preserve"> </w:t>
+      </w:r>
+      <w:r>
+        <w:rPr>
+          <w:rtl/>
+          <w:rtl/>
         </w:rPr>
         <w:t xml:space="preserve">عام (اللغة، حجم ووزن خط الواجهة، الشاشة الافتتاحية، الاهتزاز، الشاشة منورة) — المظهر (7 ثيمات + تلقائي + الوضع الليلي بعد المغرب) — المصحف (معاينة، وضع العرض، الخط، تكبير الصفحات، التجويد، الهامش، الترجمة) — التلاوة — الأذان والمواقيت (المذهب، الطريقة، التوقيت الصيفي، المدينة، العد التنازلي على الجنب، الموقع التلقائي، تعديل يدوي) — الإشعارات (كل الأنواع ومواعيدها) — الأذكار — الورد — البيانات (نسخة احتياطية، إعادة ضبط) — عن التطبيق.</w:t>
       </w:r>
     </w:p>
-    <w:bookmarkEnd w:id="29"/>
-    <w:bookmarkStart w:id="30" w:name="في-كل-التطبيق"/>
+    <w:bookmarkEnd w:id="30"/>
+    <w:bookmarkStart w:id="31" w:name="في-كل-التطبيق"/>
     <w:p>
       <w:pPr>
         <w:bidi/>
@@ -3295,8 +3403,8 @@
         <w:t xml:space="preserve">للأذان والصلاة اللي ما اتعلّمتش: «صلّيت» و«تم الرؤية».</w:t>
       </w:r>
     </w:p>
-    <w:bookmarkEnd w:id="30"/>
-    <w:bookmarkStart w:id="31" w:name="التنبيهات"/>
+    <w:bookmarkEnd w:id="31"/>
+    <w:bookmarkStart w:id="32" w:name="التنبيهات"/>
     <w:p>
       <w:pPr>
         <w:bidi/>
@@ -3991,9 +4099,9 @@
         </w:pict>
       </w:r>
     </w:p>
-    <w:bookmarkEnd w:id="31"/>
     <w:bookmarkEnd w:id="32"/>
-    <w:bookmarkStart w:id="35" w:name="هيكل-الكود"/>
+    <w:bookmarkEnd w:id="33"/>
+    <w:bookmarkStart w:id="36" w:name="هيكل-الكود"/>
     <w:p>
       <w:pPr>
         <w:bidi/>
@@ -4401,7 +4509,7 @@
         <w:t xml:space="preserve">└── theme/                  الثيمات وألوان التجويد</w:t>
       </w:r>
     </w:p>
-    <w:bookmarkStart w:id="33" w:name="ترتيب-الـ-providers"/>
+    <w:bookmarkStart w:id="34" w:name="ترتيب-الـ-providers"/>
     <w:p>
       <w:pPr>
         <w:bidi/>
@@ -4575,8 +4683,8 @@
         <w:t xml:space="preserve">RootStack</w:t>
       </w:r>
     </w:p>
-    <w:bookmarkEnd w:id="33"/>
-    <w:bookmarkStart w:id="34" w:name="التخزين-على-الجهاز-asyncstorage"/>
+    <w:bookmarkEnd w:id="34"/>
+    <w:bookmarkStart w:id="35" w:name="التخزين-على-الجهاز-asyncstorage"/>
     <w:p>
       <w:pPr>
         <w:bidi/>
@@ -4983,6 +5091,45 @@
           </w:p>
         </w:tc>
       </w:tr>
+      <w:tr>
+        <w:tc>
+          <w:tcPr/>
+          <w:p>
+            <w:pPr>
+              <w:bidi/>
+              <w:pStyle w:val="Compact"/>
+              <w:bidi/>
+              <w:jc w:val="left"/>
+            </w:pPr>
+            <w:r>
+              <w:rPr>
+                <w:rtl/>
+                <w:rStyle w:val="VerbatimChar"/>
+                <w:rtl/>
+              </w:rPr>
+              <w:t xml:space="preserve">yatlu.activityLog</w:t>
+            </w:r>
+          </w:p>
+        </w:tc>
+        <w:tc>
+          <w:tcPr/>
+          <w:p>
+            <w:pPr>
+              <w:bidi/>
+              <w:pStyle w:val="Compact"/>
+              <w:bidi/>
+              <w:jc w:val="left"/>
+            </w:pPr>
+            <w:r>
+              <w:rPr>
+                <w:rtl/>
+                <w:rtl/>
+              </w:rPr>
+              <w:t xml:space="preserve">أنشطة «أنا مسلم» (آخر 14 يوم)</w:t>
+            </w:r>
+          </w:p>
+        </w:tc>
+      </w:tr>
     </w:tbl>
     <w:p>
       <w:pPr>
@@ -5010,9 +5157,9 @@
         </w:pict>
       </w:r>
     </w:p>
-    <w:bookmarkEnd w:id="34"/>
     <w:bookmarkEnd w:id="35"/>
-    <w:bookmarkStart w:id="43" w:name="الأنظمة-الأساسية"/>
+    <w:bookmarkEnd w:id="36"/>
+    <w:bookmarkStart w:id="44" w:name="الأنظمة-الأساسية"/>
     <w:p>
       <w:pPr>
         <w:bidi/>
@@ -5027,7 +5174,7 @@
         <w:t xml:space="preserve">5. الأنظمة الأساسية</w:t>
       </w:r>
     </w:p>
-    <w:bookmarkStart w:id="36" w:name="بيانات-المصحف"/>
+    <w:bookmarkStart w:id="37" w:name="بيانات-المصحف"/>
     <w:p>
       <w:pPr>
         <w:bidi/>
@@ -5250,8 +5397,8 @@
         <w:t xml:space="preserve">— محتاج مراجعة متخصص.</w:t>
       </w:r>
     </w:p>
-    <w:bookmarkEnd w:id="36"/>
-    <w:bookmarkStart w:id="37" w:name="Xc0002c8c6b250e6e5fec0dae8409cecf88bcda3"/>
+    <w:bookmarkEnd w:id="37"/>
+    <w:bookmarkStart w:id="38" w:name="Xc0002c8c6b250e6e5fec0dae8409cecf88bcda3"/>
     <w:p>
       <w:pPr>
         <w:bidi/>
@@ -5338,8 +5485,8 @@
         <w:t xml:space="preserve">بتتحمّل وقت الحاجة.</w:t>
       </w:r>
     </w:p>
-    <w:bookmarkEnd w:id="37"/>
-    <w:bookmarkStart w:id="38" w:name="مواقيت-الصلاة"/>
+    <w:bookmarkEnd w:id="38"/>
+    <w:bookmarkStart w:id="39" w:name="مواقيت-الصلاة"/>
     <w:p>
       <w:pPr>
         <w:bidi/>
@@ -5382,8 +5529,8 @@
         <w:t xml:space="preserve">على الجهاز: الطريقة حسب البلد تلقائيًا، المذهب، التوقيت الصيفي (+ساعة)، تعديل يدوي، قاعدة خطوط العرض العالية. الموقع: GPS + أقرب مدينة من القايمة (من غير نت)، واسم المنطقة من النت اختياري.</w:t>
       </w:r>
     </w:p>
-    <w:bookmarkEnd w:id="38"/>
-    <w:bookmarkStart w:id="39" w:name="التلاوة-والاستماع"/>
+    <w:bookmarkEnd w:id="39"/>
+    <w:bookmarkStart w:id="40" w:name="التلاوة-والاستماع"/>
     <w:p>
       <w:pPr>
         <w:bidi/>
@@ -5585,8 +5732,8 @@
         <w:t xml:space="preserve">إلا اللي اتحمّل.</w:t>
       </w:r>
     </w:p>
-    <w:bookmarkEnd w:id="39"/>
-    <w:bookmarkStart w:id="40" w:name="التنبيهات-1"/>
+    <w:bookmarkEnd w:id="40"/>
+    <w:bookmarkStart w:id="41" w:name="التنبيهات-1"/>
     <w:p>
       <w:pPr>
         <w:bidi/>
@@ -5939,8 +6086,8 @@
         <w:t xml:space="preserve">حد iOS 64 إشعار → أقرب 60 ≈ ٤–٦ أيام. لو التطبيق ما اتفتحش أسبوع الإشعارات بتقف. Expo Go أندرويد: مفيش إشعارات خالص.</w:t>
       </w:r>
     </w:p>
-    <w:bookmarkEnd w:id="40"/>
-    <w:bookmarkStart w:id="41" w:name="اللغتين"/>
+    <w:bookmarkEnd w:id="41"/>
+    <w:bookmarkStart w:id="42" w:name="اللغتين"/>
     <w:p>
       <w:pPr>
         <w:bidi/>
@@ -6049,8 +6196,8 @@
         <w:t xml:space="preserve">للقرآن والأذكار.</w:t>
       </w:r>
     </w:p>
-    <w:bookmarkEnd w:id="41"/>
-    <w:bookmarkStart w:id="42" w:name="الثيمات"/>
+    <w:bookmarkEnd w:id="42"/>
+    <w:bookmarkStart w:id="43" w:name="الثيمات"/>
     <w:p>
       <w:pPr>
         <w:bidi/>
@@ -6113,9 +6260,9 @@
         </w:pict>
       </w:r>
     </w:p>
-    <w:bookmarkEnd w:id="42"/>
     <w:bookmarkEnd w:id="43"/>
-    <w:bookmarkStart w:id="44" w:name="التشغيل-والتطوير"/>
+    <w:bookmarkEnd w:id="44"/>
+    <w:bookmarkStart w:id="45" w:name="التشغيل-والتطوير"/>
     <w:p>
       <w:pPr>
         <w:bidi/>
@@ -6569,8 +6716,8 @@
         </w:pict>
       </w:r>
     </w:p>
-    <w:bookmarkEnd w:id="44"/>
-    <w:bookmarkStart w:id="46" w:name="بناء-apk-لأندرويد"/>
+    <w:bookmarkEnd w:id="45"/>
+    <w:bookmarkStart w:id="47" w:name="بناء-apk-لأندرويد"/>
     <w:p>
       <w:pPr>
         <w:bidi/>
@@ -6660,7 +6807,7 @@
         </w:rPr>
         <w:t xml:space="preserve"> </w:t>
       </w:r>
-      <w:hyperlink r:id="rId45">
+      <w:hyperlink r:id="rId46">
         <w:r>
           <w:rPr>
             <w:rtl/>
@@ -7275,8 +7422,8 @@
         </w:pict>
       </w:r>
     </w:p>
-    <w:bookmarkEnd w:id="46"/>
-    <w:bookmarkStart w:id="47" w:name="الويب"/>
+    <w:bookmarkEnd w:id="47"/>
+    <w:bookmarkStart w:id="48" w:name="الويب"/>
     <w:p>
       <w:pPr>
         <w:bidi/>
@@ -7361,8 +7508,8 @@
         </w:pict>
       </w:r>
     </w:p>
-    <w:bookmarkEnd w:id="47"/>
-    <w:bookmarkStart w:id="48" w:name="إزاي-تضيف"/>
+    <w:bookmarkEnd w:id="48"/>
+    <w:bookmarkStart w:id="49" w:name="إزاي-تضيف"/>
     <w:p>
       <w:pPr>
         <w:bidi/>
@@ -8268,8 +8415,8 @@
         </w:pict>
       </w:r>
     </w:p>
-    <w:bookmarkEnd w:id="48"/>
-    <w:bookmarkStart w:id="49" w:name="المصادر-والتراخيص"/>
+    <w:bookmarkEnd w:id="49"/>
+    <w:bookmarkStart w:id="50" w:name="المصادر-والتراخيص"/>
     <w:p>
       <w:pPr>
         <w:bidi/>
@@ -9132,8 +9279,8 @@
         </w:pict>
       </w:r>
     </w:p>
-    <w:bookmarkEnd w:id="49"/>
-    <w:bookmarkStart w:id="51" w:name="اللي-لسه-محتاج-يتعمل-قبل-النشر"/>
+    <w:bookmarkEnd w:id="50"/>
+    <w:bookmarkStart w:id="52" w:name="اللي-لسه-محتاج-يتعمل-قبل-النشر"/>
     <w:p>
       <w:pPr>
         <w:bidi/>
@@ -9545,7 +9692,7 @@
         </w:rPr>
         <w:t xml:space="preserve"> </w:t>
       </w:r>
-      <w:hyperlink r:id="rId50">
+      <w:hyperlink r:id="rId51">
         <w:r>
           <w:rPr>
             <w:rtl/>
@@ -9563,8 +9710,8 @@
         <w:t xml:space="preserve">.</w:t>
       </w:r>
     </w:p>
-    <w:bookmarkEnd w:id="51"/>
     <w:bookmarkEnd w:id="52"/>
+    <w:bookmarkEnd w:id="53"/>
     <w:sectPr/>
   </w:body>
 </w:document>

</xml_diff>

<commit_message>
Adhan sound with mute/settings actions; heads-up priority for prayer alerts
- assets/sounds/adhan.mp3 (Android, full) and adhan_short.wav (iOS, 26s), wired via app.config.js
  NOTE: source license is uncertain (Freesound #639494, extracted from YouTube) — replace before store release
- Adhan notification: "Mute" and "Settings" actions; settings opens at notifications with an explainer
- Mute button on the in-app adhan card; max priority for adhan / pre-adhan / missed-prayer notifications
- Docs, reference and changelog updated

Co-Authored-By: Claude Opus 5.5 <noreply@anthropic.com>
Claude-Session: https://claude.ai/code/session_01Ecagw4rw5ZJHN22sLkWhnn
</commit_message>
<xml_diff>
--- a/docs/yatlu-reference.docx
+++ b/docs/yatlu-reference.docx
@@ -5975,7 +5975,65 @@
           <w:bCs/>
           <w:b/>
         </w:rPr>
-        <w:t xml:space="preserve">صوت الأذان الكامل:</w:t>
+        <w:t xml:space="preserve">صوت الأذان:</w:t>
+      </w:r>
+      <w:r>
+        <w:rPr>
+          <w:rtl/>
+          <w:rtl/>
+        </w:rPr>
+        <w:t xml:space="preserve"> </w:t>
+      </w:r>
+      <w:r>
+        <w:rPr>
+          <w:rtl/>
+          <w:rStyle w:val="VerbatimChar"/>
+          <w:rtl/>
+        </w:rPr>
+        <w:t xml:space="preserve">assets/sounds/adhan.mp3</w:t>
+      </w:r>
+      <w:r>
+        <w:rPr>
+          <w:rtl/>
+          <w:rtl/>
+        </w:rPr>
+        <w:t xml:space="preserve"> </w:t>
+      </w:r>
+      <w:r>
+        <w:rPr>
+          <w:rtl/>
+          <w:rtl/>
+        </w:rPr>
+        <w:t xml:space="preserve">(أندرويد، كامل) و</w:t>
+      </w:r>
+      <w:r>
+        <w:rPr>
+          <w:rtl/>
+          <w:rtl/>
+        </w:rPr>
+        <w:t xml:space="preserve"> </w:t>
+      </w:r>
+      <w:r>
+        <w:rPr>
+          <w:rtl/>
+          <w:rStyle w:val="VerbatimChar"/>
+          <w:rtl/>
+        </w:rPr>
+        <w:t xml:space="preserve">adhan_short.wav</w:t>
+      </w:r>
+      <w:r>
+        <w:rPr>
+          <w:rtl/>
+          <w:rtl/>
+        </w:rPr>
+        <w:t xml:space="preserve"> </w:t>
+      </w:r>
+      <w:r>
+        <w:rPr>
+          <w:rtl/>
+          <w:rtl/>
+        </w:rPr>
+        <w:t xml:space="preserve">(iOS، ٢٦ ث) بيتضافوا وقت البناء من</w:t>
       </w:r>
       <w:r>
         <w:rPr>
@@ -5997,43 +6055,14 @@
           <w:rtl/>
           <w:rtl/>
         </w:rPr>
-        <w:t xml:space="preserve"> </w:t>
-      </w:r>
-      <w:r>
-        <w:rPr>
-          <w:rtl/>
-          <w:rtl/>
-        </w:rPr>
-        <w:t xml:space="preserve">بيضيف</w:t>
-      </w:r>
-      <w:r>
-        <w:rPr>
-          <w:rtl/>
-          <w:rtl/>
-        </w:rPr>
-        <w:t xml:space="preserve"> </w:t>
-      </w:r>
-      <w:r>
-        <w:rPr>
-          <w:rtl/>
-          <w:rStyle w:val="VerbatimChar"/>
-          <w:rtl/>
-        </w:rPr>
-        <w:t xml:space="preserve">assets/sounds/adhan.wav</w:t>
-      </w:r>
-      <w:r>
-        <w:rPr>
-          <w:rtl/>
-          <w:rtl/>
-        </w:rPr>
-        <w:t xml:space="preserve"> </w:t>
-      </w:r>
-      <w:r>
-        <w:rPr>
-          <w:rtl/>
-          <w:rtl/>
-        </w:rPr>
-        <w:t xml:space="preserve">لو موجود (</w:t>
+        <w:t xml:space="preserve">. إشعار الأذان بيظهر فوق الشاشة وفيه «كتم» و«الإعدادات».</w:t>
+      </w:r>
+      <w:r>
+        <w:rPr>
+          <w:rtl/>
+          <w:rtl/>
+        </w:rPr>
+        <w:t xml:space="preserve"> </w:t>
       </w:r>
       <w:r>
         <w:rPr>
@@ -6042,14 +6071,7 @@
           <w:bCs/>
           <w:b/>
         </w:rPr>
-        <w:t xml:space="preserve">محتاج ملف مرخّص</w:t>
-      </w:r>
-      <w:r>
-        <w:rPr>
-          <w:rtl/>
-          <w:rtl/>
-        </w:rPr>
-        <w:t xml:space="preserve">).</w:t>
+        <w:t xml:space="preserve">الملف الحالي رخصته غير مؤكدة — لازم يتبدّل قبل النشر.</w:t>
       </w:r>
     </w:p>
     <w:p>
@@ -9406,36 +9428,21 @@
           <w:bCs/>
           <w:b/>
         </w:rPr>
-        <w:t xml:space="preserve">ملف أذان برخصة واضحة</w:t>
-      </w:r>
-      <w:r>
-        <w:rPr>
-          <w:rtl/>
-          <w:rtl/>
-        </w:rPr>
-        <w:t xml:space="preserve"> </w:t>
-      </w:r>
-      <w:r>
-        <w:rPr>
-          <w:rtl/>
-          <w:rtl/>
-        </w:rPr>
-        <w:t xml:space="preserve">(</w:t>
-      </w:r>
-      <w:r>
-        <w:rPr>
-          <w:rtl/>
-          <w:rStyle w:val="VerbatimChar"/>
-          <w:rtl/>
-        </w:rPr>
-        <w:t xml:space="preserve">assets/sounds/adhan.wav</w:t>
-      </w:r>
-      <w:r>
-        <w:rPr>
-          <w:rtl/>
-          <w:rtl/>
-        </w:rPr>
-        <w:t xml:space="preserve">).</w:t>
+        <w:t xml:space="preserve">تبديل ملف الأذان</w:t>
+      </w:r>
+      <w:r>
+        <w:rPr>
+          <w:rtl/>
+          <w:rtl/>
+        </w:rPr>
+        <w:t xml:space="preserve"> </w:t>
+      </w:r>
+      <w:r>
+        <w:rPr>
+          <w:rtl/>
+          <w:rtl/>
+        </w:rPr>
+        <w:t xml:space="preserve">بتسجيل رخصته سليمة (الحالي للتجربة بس).</w:t>
       </w:r>
     </w:p>
     <w:p>

</xml_diff>